<commit_message>
fix(docx-remediation): wave 03a single document placeholders for BM-164-183
Co-authored-by: Cursor <cursoragent@cursor.com>
</commit_message>
<xml_diff>
--- a/storage/templates/normalized-docx/BM-164/BM-164_normalized.docx
+++ b/storage/templates/normalized-docx/BM-164/BM-164_normalized.docx
@@ -727,7 +727,7 @@
           <w:rFonts w:cs="Times New Roman" w:ascii="Times New Roman" w:hAnsi="Times New Roman"/>
           <w:szCs w:val="28"/>
         </w:rPr>
-        <w:t>{{document.field}}</w:t>
+        <w:t>{{document.fullDocumentCode}}</w:t>
       </w:r>
       <w:r>
         <w:rPr>
@@ -824,7 +824,7 @@
           <w:spacing w:val="-2"/>
           <w:szCs w:val="28"/>
         </w:rPr>
-        <w:t>{{recipients.field}}</w:t>
+        <w:t>{{recipients.personLine2}}</w:t>
         <w:tab/>
         <w:tab/>
       </w:r>
@@ -852,7 +852,7 @@
           <w:spacing w:val="-2"/>
           <w:szCs w:val="28"/>
         </w:rPr>
-        <w:t>{{recipients.field}}</w:t>
+        <w:t>{{recipients.personLine3}}</w:t>
         <w:tab/>
         <w:tab/>
         <w:t xml:space="preserve"> </w:t>
@@ -933,7 +933,7 @@
           <w:spacing w:val="-2"/>
           <w:szCs w:val="28"/>
         </w:rPr>
-        <w:t xml:space="preserve">{{recipients.field}}</w:t>
+        <w:t xml:space="preserve">{{recipients.personLine4}}</w:t>
         <w:tab/>
         <w:tab/>
       </w:r>
@@ -1033,7 +1033,7 @@
           <w:szCs w:val="28"/>
           <w:lang w:eastAsia="vi-VN"/>
         </w:rPr>
-        <w:t>{{recipients.field}}</w:t>
+        <w:t>{{recipients.personLine5}}</w:t>
       </w:r>
     </w:p>
     <w:p>
@@ -1092,7 +1092,7 @@
           <w:spacing w:val="-2"/>
           <w:szCs w:val="28"/>
         </w:rPr>
-        <w:t>{{recipients.field}}</w:t>
+        <w:t>{{recipients.personLine6}}</w:t>
       </w:r>
     </w:p>
     <w:p>

</xml_diff>